<commit_message>
docs(submission): standardize document status and use full member legal names
- Applied full legal names matching Capstone 1 proposal:
  Riva, Zendrix (Team Lead); Palis, John James; Miel, Kaysean;
  Durano, Ashlee Skye; Bien, Erik Samuel
- Standardized Document Status to 'Submitted for Adviser Review and Evaluation'
  across SRS v3.0, SDD v2.0, and SPMP v2.0 front-matter
- Cleaned internal developer sprint notes from title headers
- Recompiled all 4 DOCX and PDF deliverables in docs/submission/
- Updated SESSION_HANDOFF.md for Claude review
</commit_message>
<xml_diff>
--- a/docs/MVP_Validation_Findings_and_Refactoring_Priorities_Filled.docx
+++ b/docs/MVP_Validation_Findings_and_Refactoring_Priorities_Filled.docx
@@ -177,7 +177,7 @@
         <w:rPr>
           <w:sz w:val="20"/>
         </w:rPr>
-        <w:t>Palis, J. J. (Frontend &amp; Audio Engineer)</w:t>
+        <w:t>Palis, John James (Frontend &amp; Audio Engineer)</w:t>
       </w:r>
       <w:r>
         <w:br/>
@@ -186,7 +186,7 @@
         <w:rPr>
           <w:sz w:val="20"/>
         </w:rPr>
-        <w:t>Miel, K. (UX/UI Designer &amp; QA Specialist)</w:t>
+        <w:t>Miel, Kaysean (UX/UI Designer &amp; QA Specialist)</w:t>
       </w:r>
       <w:r>
         <w:br/>
@@ -195,7 +195,7 @@
         <w:rPr>
           <w:sz w:val="20"/>
         </w:rPr>
-        <w:t>Durano, A. S. (Data Architect &amp; Backend Engineer)</w:t>
+        <w:t>Durano, Ashlee Skye (Data Architect &amp; Backend Engineer)</w:t>
       </w:r>
       <w:r>
         <w:br/>
@@ -204,7 +204,7 @@
         <w:rPr>
           <w:sz w:val="20"/>
         </w:rPr>
-        <w:t>Bien, E. S. (Pedagogical Researcher &amp; Documentation Specialist)</w:t>
+        <w:t>Bien, Erik Samuel (Pedagogical Researcher &amp; Documentation Specialist)</w:t>
       </w:r>
     </w:p>
     <w:p>

</xml_diff>

<commit_message>
docs(submission): add CIT-U logo to document cover pages and render standalone deliverables
</commit_message>
<xml_diff>
--- a/docs/MVP_Validation_Findings_and_Refactoring_Priorities_Filled.docx
+++ b/docs/MVP_Validation_Findings_and_Refactoring_Priorities_Filled.docx
@@ -2,6 +2,46 @@
 <file path=word/document.xml><?xml version="1.0" encoding="utf-8"?>
 <w:document xmlns:mc="http://schemas.openxmlformats.org/markup-compatibility/2006" xmlns:o="urn:schemas-microsoft-com:office:office" xmlns:r="http://schemas.openxmlformats.org/officeDocument/2006/relationships" xmlns:m="http://schemas.openxmlformats.org/officeDocument/2006/math" xmlns:v="urn:schemas-microsoft-com:vml" xmlns:wp="http://schemas.openxmlformats.org/drawingml/2006/wordprocessingDrawing" xmlns:w10="urn:schemas-microsoft-com:office:word" xmlns:w="http://schemas.openxmlformats.org/wordprocessingml/2006/main" xmlns:wne="http://schemas.microsoft.com/office/word/2006/wordml" xmlns:sl="http://schemas.openxmlformats.org/schemaLibrary/2006/main" xmlns:a="http://schemas.openxmlformats.org/drawingml/2006/main" xmlns:pic="http://schemas.openxmlformats.org/drawingml/2006/picture" xmlns:c="http://schemas.openxmlformats.org/drawingml/2006/chart" xmlns:lc="http://schemas.openxmlformats.org/drawingml/2006/lockedCanvas" xmlns:dgm="http://schemas.openxmlformats.org/drawingml/2006/diagram" xmlns:wps="http://schemas.microsoft.com/office/word/2010/wordprocessingShape" xmlns:wpg="http://schemas.microsoft.com/office/word/2010/wordprocessingGroup" xmlns:w14="http://schemas.microsoft.com/office/word/2010/wordml" xmlns:w15="http://schemas.microsoft.com/office/word/2012/wordml" xmlns:w16="http://schemas.microsoft.com/office/word/2018/wordml" xmlns:w16cex="http://schemas.microsoft.com/office/word/2018/wordml/cex" xmlns:w16cid="http://schemas.microsoft.com/office/word/2016/wordml/cid" xmlns="http://schemas.microsoft.com/office/tasks/2019/documenttasks" xmlns:cr="http://schemas.microsoft.com/office/comments/2020/reactions">
   <w:body>
+    <w:p>
+      <w:pPr>
+        <w:spacing w:before="80" w:after="240"/>
+        <w:jc w:val="center"/>
+      </w:pPr>
+      <w:r>
+        <w:drawing>
+          <wp:inline>
+            <wp:extent cx="1371600" cy="969764"/>
+            <wp:docPr id="1" name="Picture 1"/>
+            <wp:cNvGraphicFramePr>
+              <a:graphicFrameLocks noChangeAspect="1"/>
+            </wp:cNvGraphicFramePr>
+            <a:graphic>
+              <a:graphicData uri="http://schemas.openxmlformats.org/drawingml/2006/picture">
+                <pic:pic>
+                  <pic:nvPicPr>
+                    <pic:cNvPr id="0" name="logocit-1.png"/>
+                    <pic:cNvPicPr/>
+                  </pic:nvPicPr>
+                  <pic:blipFill>
+                    <a:blip r:embed="rId6"/>
+                    <a:stretch>
+                      <a:fillRect/>
+                    </a:stretch>
+                  </pic:blipFill>
+                  <pic:spPr>
+                    <a:xfrm>
+                      <a:off x="0" y="0"/>
+                      <a:ext cx="1371600" cy="969764"/>
+                    </a:xfrm>
+                    <a:prstGeom prst="rect"/>
+                  </pic:spPr>
+                </pic:pic>
+              </a:graphicData>
+            </a:graphic>
+          </wp:inline>
+        </w:drawing>
+      </w:r>
+    </w:p>
     <w:p>
       <w:pPr>
         <w:pStyle w:val="Heading3"/>
@@ -12485,7 +12525,7 @@
       </w:r>
     </w:p>
     <w:sectPr>
-      <w:footerReference w:type="default" r:id="rId6"/>
+      <w:footerReference w:type="default" r:id="rId7"/>
       <w:pgSz w:h="15840" w:w="12240" w:orient="portrait"/>
       <w:pgMar w:bottom="1440" w:top="1440" w:left="1440" w:right="1440" w:header="720" w:footer="720"/>
       <w:pgNumType w:start="1"/>

</xml_diff>